<commit_message>
done some every block
</commit_message>
<xml_diff>
--- a/Syntax.docx
+++ b/Syntax.docx
@@ -1174,7 +1174,10 @@
               <w:rPr/>
             </w:pPr>
             <w:r>
-              <w:rPr/>
+              <w:rPr>
+                <w:rStyle w:val="Strong"/>
+              </w:rPr>
+              <w:t>Метод every()</w:t>
             </w:r>
           </w:p>
         </w:tc>
@@ -1186,6 +1189,158 @@
               <w:bottom w:val="single" w:sz="4" w:space="0" w:color="000000"/>
             </w:tcBorders>
           </w:tcPr>
+          <w:p>
+            <w:pPr>
+              <w:pStyle w:val="Style19"/>
+              <w:widowControl/>
+              <w:pBdr/>
+              <w:bidi w:val="0"/>
+              <w:spacing w:before="75" w:after="75"/>
+              <w:ind w:hanging="0" w:start="0" w:end="0"/>
+              <w:jc w:val="start"/>
+              <w:rPr>
+                <w:rFonts w:ascii="Fira Code;monospace" w:hAnsi="Fira Code;monospace"/>
+                <w:b w:val="false"/>
+                <w:i w:val="false"/>
+                <w:caps w:val="false"/>
+                <w:smallCaps w:val="false"/>
+                <w:color w:val="2F2F37"/>
+                <w:spacing w:val="0"/>
+                <w:sz w:val="27"/>
+              </w:rPr>
+            </w:pPr>
+            <w:r>
+              <w:rPr>
+                <w:rFonts w:ascii="Fira Code;monospace" w:hAnsi="Fira Code;monospace"/>
+                <w:b w:val="false"/>
+                <w:i w:val="false"/>
+                <w:caps w:val="false"/>
+                <w:smallCaps w:val="false"/>
+                <w:color w:val="E6C07B"/>
+                <w:spacing w:val="0"/>
+                <w:sz w:val="27"/>
+              </w:rPr>
+              <w:t>array</w:t>
+            </w:r>
+            <w:r>
+              <w:rPr>
+                <w:rFonts w:ascii="Fira Code;monospace" w:hAnsi="Fira Code;monospace"/>
+                <w:b w:val="false"/>
+                <w:i w:val="false"/>
+                <w:caps w:val="false"/>
+                <w:smallCaps w:val="false"/>
+                <w:color w:val="2F2F37"/>
+                <w:spacing w:val="0"/>
+                <w:sz w:val="27"/>
+              </w:rPr>
+              <w:t xml:space="preserve">.every((element, index, </w:t>
+            </w:r>
+            <w:r>
+              <w:rPr>
+                <w:rFonts w:ascii="Fira Code;monospace" w:hAnsi="Fira Code;monospace"/>
+                <w:b w:val="false"/>
+                <w:i w:val="false"/>
+                <w:caps w:val="false"/>
+                <w:smallCaps w:val="false"/>
+                <w:color w:val="E6C07B"/>
+                <w:spacing w:val="0"/>
+                <w:sz w:val="27"/>
+              </w:rPr>
+              <w:t>array</w:t>
+            </w:r>
+            <w:r>
+              <w:rPr>
+                <w:rFonts w:ascii="Fira Code;monospace" w:hAnsi="Fira Code;monospace"/>
+                <w:b w:val="false"/>
+                <w:i w:val="false"/>
+                <w:caps w:val="false"/>
+                <w:smallCaps w:val="false"/>
+                <w:color w:val="2F2F37"/>
+                <w:spacing w:val="0"/>
+                <w:sz w:val="27"/>
+              </w:rPr>
+              <w:t>) =&gt; {</w:t>
+            </w:r>
+          </w:p>
+          <w:p>
+            <w:pPr>
+              <w:pStyle w:val="Style19"/>
+              <w:widowControl/>
+              <w:pBdr/>
+              <w:shd w:fill="E2E5E8" w:val="clear"/>
+              <w:bidi w:val="0"/>
+              <w:spacing w:before="75" w:after="75"/>
+              <w:ind w:hanging="0" w:start="0" w:end="0"/>
+              <w:jc w:val="start"/>
+              <w:rPr>
+                <w:rFonts w:ascii="Fira Code;monospace" w:hAnsi="Fira Code;monospace"/>
+                <w:caps w:val="false"/>
+                <w:smallCaps w:val="false"/>
+                <w:color w:val="2F2F37"/>
+                <w:spacing w:val="0"/>
+                <w:sz w:val="27"/>
+              </w:rPr>
+            </w:pPr>
+            <w:r>
+              <w:rPr>
+                <w:rFonts w:ascii="Fira Code;monospace" w:hAnsi="Fira Code;monospace"/>
+                <w:caps w:val="false"/>
+                <w:smallCaps w:val="false"/>
+                <w:color w:val="2F2F37"/>
+                <w:spacing w:val="0"/>
+                <w:sz w:val="27"/>
+              </w:rPr>
+              <w:t xml:space="preserve">  </w:t>
+            </w:r>
+            <w:r>
+              <w:rPr>
+                <w:rFonts w:ascii="Fira Code;monospace" w:hAnsi="Fira Code;monospace"/>
+                <w:b w:val="false"/>
+                <w:i/>
+                <w:caps w:val="false"/>
+                <w:smallCaps w:val="false"/>
+                <w:color w:val="5C6370"/>
+                <w:spacing w:val="0"/>
+                <w:sz w:val="27"/>
+              </w:rPr>
+              <w:t>// Тіло колбек-функції</w:t>
+            </w:r>
+          </w:p>
+          <w:p>
+            <w:pPr>
+              <w:pStyle w:val="Style19"/>
+              <w:widowControl/>
+              <w:pBdr/>
+              <w:shd w:fill="E2E5E8" w:val="clear"/>
+              <w:bidi w:val="0"/>
+              <w:spacing w:before="75" w:after="75"/>
+              <w:ind w:hanging="0" w:start="0" w:end="0"/>
+              <w:jc w:val="start"/>
+              <w:rPr>
+                <w:rFonts w:ascii="Fira Code;monospace" w:hAnsi="Fira Code;monospace"/>
+                <w:b w:val="false"/>
+                <w:i w:val="false"/>
+                <w:caps w:val="false"/>
+                <w:smallCaps w:val="false"/>
+                <w:color w:val="2F2F37"/>
+                <w:spacing w:val="0"/>
+                <w:sz w:val="27"/>
+              </w:rPr>
+            </w:pPr>
+            <w:r>
+              <w:rPr>
+                <w:rFonts w:ascii="Fira Code;monospace" w:hAnsi="Fira Code;monospace"/>
+                <w:b w:val="false"/>
+                <w:i w:val="false"/>
+                <w:caps w:val="false"/>
+                <w:smallCaps w:val="false"/>
+                <w:color w:val="2F2F37"/>
+                <w:spacing w:val="0"/>
+                <w:sz w:val="27"/>
+              </w:rPr>
+              <w:t>});</w:t>
+            </w:r>
+          </w:p>
           <w:p>
             <w:pPr>
               <w:pStyle w:val="Style19"/>
@@ -1232,9 +1387,23 @@
           <w:p>
             <w:pPr>
               <w:pStyle w:val="BodyText"/>
-              <w:bidi w:val="0"/>
-              <w:spacing w:before="0" w:after="140"/>
-              <w:jc w:val="start"/>
+              <w:widowControl/>
+              <w:numPr>
+                <w:ilvl w:val="0"/>
+                <w:numId w:val="3"/>
+              </w:numPr>
+              <w:pBdr/>
+              <w:tabs>
+                <w:tab w:val="clear" w:pos="709"/>
+                <w:tab w:val="left" w:pos="0" w:leader="none"/>
+              </w:tabs>
+              <w:bidi w:val="0"/>
+              <w:spacing w:before="0" w:after="0"/>
+              <w:ind w:hanging="0" w:start="0" w:end="0"/>
+              <w:jc w:val="start"/>
+              <w:rPr/>
+            </w:pPr>
+            <w:r>
               <w:rPr>
                 <w:rFonts w:ascii="Montserrat;apple-system;BlinkMacSystemFont;Segoe UI;Roboto;Oxygen;Ubuntu;Cantarell;Open Sans;Helvetica Neue;sans-serif" w:hAnsi="Montserrat;apple-system;BlinkMacSystemFont;Segoe UI;Roboto;Oxygen;Ubuntu;Cantarell;Open Sans;Helvetica Neue;sans-serif"/>
                 <w:b w:val="false"/>
@@ -1247,9 +1416,11 @@
                 <w:sz w:val="20"/>
                 <w:szCs w:val="20"/>
               </w:rPr>
-            </w:pPr>
-            <w:r>
-              <w:rPr>
+              <w:t>Метод </w:t>
+            </w:r>
+            <w:r>
+              <w:rPr>
+                <w:rStyle w:val="Style15"/>
                 <w:rFonts w:ascii="Montserrat;apple-system;BlinkMacSystemFont;Segoe UI;Roboto;Oxygen;Ubuntu;Cantarell;Open Sans;Helvetica Neue;sans-serif" w:hAnsi="Montserrat;apple-system;BlinkMacSystemFont;Segoe UI;Roboto;Oxygen;Ubuntu;Cantarell;Open Sans;Helvetica Neue;sans-serif"/>
                 <w:b w:val="false"/>
                 <w:bCs/>
@@ -1260,6 +1431,1480 @@
                 <w:spacing w:val="0"/>
                 <w:sz w:val="20"/>
                 <w:szCs w:val="20"/>
+              </w:rPr>
+              <w:t>every(callback)</w:t>
+            </w:r>
+            <w:r>
+              <w:rPr>
+                <w:rFonts w:ascii="Montserrat;apple-system;BlinkMacSystemFont;Segoe UI;Roboto;Oxygen;Ubuntu;Cantarell;Open Sans;Helvetica Neue;sans-serif" w:hAnsi="Montserrat;apple-system;BlinkMacSystemFont;Segoe UI;Roboto;Oxygen;Ubuntu;Cantarell;Open Sans;Helvetica Neue;sans-serif"/>
+                <w:b w:val="false"/>
+                <w:bCs/>
+                <w:i w:val="false"/>
+                <w:caps w:val="false"/>
+                <w:smallCaps w:val="false"/>
+                <w:color w:val="2F2F37"/>
+                <w:spacing w:val="0"/>
+                <w:sz w:val="20"/>
+                <w:szCs w:val="20"/>
+              </w:rPr>
+              <w:t> перевіряє, чи задовольняють </w:t>
+            </w:r>
+            <w:r>
+              <w:rPr>
+                <w:rStyle w:val="Strong"/>
+                <w:rFonts w:ascii="Montserrat;apple-system;BlinkMacSystemFont;Segoe UI;Roboto;Oxygen;Ubuntu;Cantarell;Open Sans;Helvetica Neue;sans-serif" w:hAnsi="Montserrat;apple-system;BlinkMacSystemFont;Segoe UI;Roboto;Oxygen;Ubuntu;Cantarell;Open Sans;Helvetica Neue;sans-serif"/>
+                <w:b w:val="false"/>
+                <w:bCs/>
+                <w:i w:val="false"/>
+                <w:caps w:val="false"/>
+                <w:smallCaps w:val="false"/>
+                <w:color w:val="2F2F37"/>
+                <w:spacing w:val="0"/>
+                <w:sz w:val="20"/>
+                <w:szCs w:val="20"/>
+              </w:rPr>
+              <w:t>усі елементи</w:t>
+            </w:r>
+            <w:r>
+              <w:rPr>
+                <w:rFonts w:ascii="Montserrat;apple-system;BlinkMacSystemFont;Segoe UI;Roboto;Oxygen;Ubuntu;Cantarell;Open Sans;Helvetica Neue;sans-serif" w:hAnsi="Montserrat;apple-system;BlinkMacSystemFont;Segoe UI;Roboto;Oxygen;Ubuntu;Cantarell;Open Sans;Helvetica Neue;sans-serif"/>
+                <w:b w:val="false"/>
+                <w:bCs/>
+                <w:i w:val="false"/>
+                <w:caps w:val="false"/>
+                <w:smallCaps w:val="false"/>
+                <w:color w:val="2F2F37"/>
+                <w:spacing w:val="0"/>
+                <w:sz w:val="20"/>
+                <w:szCs w:val="20"/>
+              </w:rPr>
+              <w:t> умову колбек-функції.</w:t>
+            </w:r>
+          </w:p>
+          <w:p>
+            <w:pPr>
+              <w:pStyle w:val="BodyText"/>
+              <w:widowControl/>
+              <w:numPr>
+                <w:ilvl w:val="0"/>
+                <w:numId w:val="3"/>
+              </w:numPr>
+              <w:pBdr/>
+              <w:tabs>
+                <w:tab w:val="clear" w:pos="709"/>
+                <w:tab w:val="left" w:pos="0" w:leader="none"/>
+              </w:tabs>
+              <w:bidi w:val="0"/>
+              <w:spacing w:before="0" w:after="0"/>
+              <w:ind w:hanging="0" w:start="0" w:end="0"/>
+              <w:jc w:val="start"/>
+              <w:rPr/>
+            </w:pPr>
+            <w:r>
+              <w:rPr>
+                <w:rStyle w:val="Strong"/>
+                <w:rFonts w:ascii="Montserrat;apple-system;BlinkMacSystemFont;Segoe UI;Roboto;Oxygen;Ubuntu;Cantarell;Open Sans;Helvetica Neue;sans-serif" w:hAnsi="Montserrat;apple-system;BlinkMacSystemFont;Segoe UI;Roboto;Oxygen;Ubuntu;Cantarell;Open Sans;Helvetica Neue;sans-serif"/>
+                <w:b w:val="false"/>
+                <w:i w:val="false"/>
+                <w:caps w:val="false"/>
+                <w:smallCaps w:val="false"/>
+                <w:color w:val="2F2F37"/>
+                <w:spacing w:val="0"/>
+                <w:sz w:val="20"/>
+                <w:szCs w:val="20"/>
+              </w:rPr>
+              <w:t>Не змінює оригінальний масив</w:t>
+            </w:r>
+          </w:p>
+          <w:p>
+            <w:pPr>
+              <w:pStyle w:val="BodyText"/>
+              <w:widowControl/>
+              <w:numPr>
+                <w:ilvl w:val="0"/>
+                <w:numId w:val="3"/>
+              </w:numPr>
+              <w:pBdr/>
+              <w:tabs>
+                <w:tab w:val="clear" w:pos="709"/>
+                <w:tab w:val="left" w:pos="0" w:leader="none"/>
+              </w:tabs>
+              <w:bidi w:val="0"/>
+              <w:spacing w:before="0" w:after="0"/>
+              <w:ind w:hanging="0" w:start="0" w:end="0"/>
+              <w:jc w:val="start"/>
+              <w:rPr/>
+            </w:pPr>
+            <w:r>
+              <w:rPr>
+                <w:rStyle w:val="Strong"/>
+                <w:rFonts w:ascii="Montserrat;apple-system;BlinkMacSystemFont;Segoe UI;Roboto;Oxygen;Ubuntu;Cantarell;Open Sans;Helvetica Neue;sans-serif" w:hAnsi="Montserrat;apple-system;BlinkMacSystemFont;Segoe UI;Roboto;Oxygen;Ubuntu;Cantarell;Open Sans;Helvetica Neue;sans-serif"/>
+                <w:b w:val="false"/>
+                <w:i w:val="false"/>
+                <w:caps w:val="false"/>
+                <w:smallCaps w:val="false"/>
+                <w:color w:val="2F2F37"/>
+                <w:spacing w:val="0"/>
+                <w:sz w:val="20"/>
+                <w:szCs w:val="20"/>
+              </w:rPr>
+              <w:t>Поелементно перебирає оригінальний масив</w:t>
+            </w:r>
+          </w:p>
+          <w:p>
+            <w:pPr>
+              <w:pStyle w:val="BodyText"/>
+              <w:widowControl/>
+              <w:numPr>
+                <w:ilvl w:val="0"/>
+                <w:numId w:val="3"/>
+              </w:numPr>
+              <w:pBdr/>
+              <w:tabs>
+                <w:tab w:val="clear" w:pos="709"/>
+                <w:tab w:val="left" w:pos="0" w:leader="none"/>
+              </w:tabs>
+              <w:bidi w:val="0"/>
+              <w:spacing w:before="0" w:after="0"/>
+              <w:ind w:hanging="0" w:start="0" w:end="0"/>
+              <w:jc w:val="start"/>
+              <w:rPr/>
+            </w:pPr>
+            <w:r>
+              <w:rPr>
+                <w:rStyle w:val="Strong"/>
+                <w:rFonts w:ascii="Montserrat;apple-system;BlinkMacSystemFont;Segoe UI;Roboto;Oxygen;Ubuntu;Cantarell;Open Sans;Helvetica Neue;sans-serif" w:hAnsi="Montserrat;apple-system;BlinkMacSystemFont;Segoe UI;Roboto;Oxygen;Ubuntu;Cantarell;Open Sans;Helvetica Neue;sans-serif"/>
+                <w:b w:val="false"/>
+                <w:i w:val="false"/>
+                <w:caps w:val="false"/>
+                <w:smallCaps w:val="false"/>
+                <w:color w:val="2F2F37"/>
+                <w:spacing w:val="0"/>
+                <w:sz w:val="20"/>
+                <w:szCs w:val="20"/>
+              </w:rPr>
+              <w:t>Повертає true, якщо всі елементи масиву задовольняють умову</w:t>
+            </w:r>
+          </w:p>
+          <w:p>
+            <w:pPr>
+              <w:pStyle w:val="BodyText"/>
+              <w:widowControl/>
+              <w:numPr>
+                <w:ilvl w:val="0"/>
+                <w:numId w:val="3"/>
+              </w:numPr>
+              <w:pBdr/>
+              <w:tabs>
+                <w:tab w:val="clear" w:pos="709"/>
+                <w:tab w:val="left" w:pos="0" w:leader="none"/>
+              </w:tabs>
+              <w:bidi w:val="0"/>
+              <w:spacing w:before="0" w:after="0"/>
+              <w:ind w:hanging="0" w:start="0" w:end="0"/>
+              <w:jc w:val="start"/>
+              <w:rPr/>
+            </w:pPr>
+            <w:r>
+              <w:rPr>
+                <w:rStyle w:val="Strong"/>
+                <w:rFonts w:ascii="Montserrat;apple-system;BlinkMacSystemFont;Segoe UI;Roboto;Oxygen;Ubuntu;Cantarell;Open Sans;Helvetica Neue;sans-serif" w:hAnsi="Montserrat;apple-system;BlinkMacSystemFont;Segoe UI;Roboto;Oxygen;Ubuntu;Cantarell;Open Sans;Helvetica Neue;sans-serif"/>
+                <w:b w:val="false"/>
+                <w:i w:val="false"/>
+                <w:caps w:val="false"/>
+                <w:smallCaps w:val="false"/>
+                <w:color w:val="2F2F37"/>
+                <w:spacing w:val="0"/>
+                <w:sz w:val="20"/>
+                <w:szCs w:val="20"/>
+              </w:rPr>
+              <w:t>Повертає false, якщо хоча б один елемент масиву не задовольняє умову</w:t>
+            </w:r>
+          </w:p>
+          <w:p>
+            <w:pPr>
+              <w:pStyle w:val="BodyText"/>
+              <w:widowControl/>
+              <w:numPr>
+                <w:ilvl w:val="0"/>
+                <w:numId w:val="3"/>
+              </w:numPr>
+              <w:pBdr/>
+              <w:tabs>
+                <w:tab w:val="clear" w:pos="709"/>
+                <w:tab w:val="left" w:pos="0" w:leader="none"/>
+              </w:tabs>
+              <w:bidi w:val="0"/>
+              <w:spacing w:before="0" w:after="0"/>
+              <w:ind w:hanging="0" w:start="0" w:end="0"/>
+              <w:jc w:val="start"/>
+              <w:rPr/>
+            </w:pPr>
+            <w:r>
+              <w:rPr>
+                <w:rStyle w:val="Strong"/>
+                <w:rFonts w:ascii="Montserrat;apple-system;BlinkMacSystemFont;Segoe UI;Roboto;Oxygen;Ubuntu;Cantarell;Open Sans;Helvetica Neue;sans-serif" w:hAnsi="Montserrat;apple-system;BlinkMacSystemFont;Segoe UI;Roboto;Oxygen;Ubuntu;Cantarell;Open Sans;Helvetica Neue;sans-serif"/>
+                <w:b w:val="false"/>
+                <w:i w:val="false"/>
+                <w:caps w:val="false"/>
+                <w:smallCaps w:val="false"/>
+                <w:color w:val="2F2F37"/>
+                <w:spacing w:val="0"/>
+                <w:sz w:val="20"/>
+                <w:szCs w:val="20"/>
+              </w:rPr>
+              <w:t>Перебирання масиву припиняється, якщо колбек повертає false</w:t>
+            </w:r>
+          </w:p>
+          <w:p>
+            <w:pPr>
+              <w:pStyle w:val="BodyText"/>
+              <w:widowControl/>
+              <w:numPr>
+                <w:ilvl w:val="0"/>
+                <w:numId w:val="0"/>
+              </w:numPr>
+              <w:pBdr/>
+              <w:bidi w:val="0"/>
+              <w:spacing w:before="0" w:after="0"/>
+              <w:ind w:hanging="0" w:start="0" w:end="0"/>
+              <w:jc w:val="start"/>
+              <w:rPr>
+                <w:rStyle w:val="Strong"/>
+                <w:rFonts w:ascii="Montserrat;apple-system;BlinkMacSystemFont;Segoe UI;Roboto;Oxygen;Ubuntu;Cantarell;Open Sans;Helvetica Neue;sans-serif" w:hAnsi="Montserrat;apple-system;BlinkMacSystemFont;Segoe UI;Roboto;Oxygen;Ubuntu;Cantarell;Open Sans;Helvetica Neue;sans-serif"/>
+                <w:b w:val="false"/>
+                <w:i w:val="false"/>
+                <w:caps w:val="false"/>
+                <w:smallCaps w:val="false"/>
+                <w:color w:val="2F2F37"/>
+                <w:spacing w:val="0"/>
+                <w:sz w:val="20"/>
+                <w:szCs w:val="20"/>
+              </w:rPr>
+            </w:pPr>
+            <w:r>
+              <w:rPr/>
+            </w:r>
+          </w:p>
+        </w:tc>
+      </w:tr>
+      <w:tr>
+        <w:trPr/>
+        <w:tc>
+          <w:tcPr>
+            <w:tcW w:w="1753" w:type="dxa"/>
+            <w:tcBorders>
+              <w:start w:val="single" w:sz="4" w:space="0" w:color="000000"/>
+              <w:bottom w:val="single" w:sz="4" w:space="0" w:color="000000"/>
+            </w:tcBorders>
+          </w:tcPr>
+          <w:p>
+            <w:pPr>
+              <w:pStyle w:val="Style18"/>
+              <w:bidi w:val="0"/>
+              <w:jc w:val="start"/>
+              <w:rPr/>
+            </w:pPr>
+            <w:r>
+              <w:rPr>
+                <w:rStyle w:val="Strong"/>
+                <w:rFonts w:ascii="Montserrat;apple-system;BlinkMacSystemFont;Segoe UI;Roboto;Oxygen;Ubuntu;Cantarell;Open Sans;Helvetica Neue;sans-serif" w:hAnsi="Montserrat;apple-system;BlinkMacSystemFont;Segoe UI;Roboto;Oxygen;Ubuntu;Cantarell;Open Sans;Helvetica Neue;sans-serif"/>
+                <w:b w:val="false"/>
+                <w:i w:val="false"/>
+                <w:caps w:val="false"/>
+                <w:smallCaps w:val="false"/>
+                <w:color w:val="2F2F37"/>
+                <w:spacing w:val="0"/>
+                <w:sz w:val="36"/>
+              </w:rPr>
+              <w:t>Метод </w:t>
+            </w:r>
+            <w:r>
+              <w:rPr>
+                <w:rStyle w:val="Strong"/>
+                <w:rFonts w:ascii="Fira Code;monospace" w:hAnsi="Fira Code;monospace"/>
+                <w:b/>
+                <w:i w:val="false"/>
+                <w:caps w:val="false"/>
+                <w:smallCaps w:val="false"/>
+                <w:color w:val="2F2F37"/>
+                <w:spacing w:val="0"/>
+                <w:sz w:val="36"/>
+                <w:shd w:fill="ECEFF1" w:val="clear"/>
+              </w:rPr>
+              <w:t>some()</w:t>
+            </w:r>
+          </w:p>
+        </w:tc>
+        <w:tc>
+          <w:tcPr>
+            <w:tcW w:w="3564" w:type="dxa"/>
+            <w:tcBorders>
+              <w:start w:val="single" w:sz="4" w:space="0" w:color="000000"/>
+              <w:bottom w:val="single" w:sz="4" w:space="0" w:color="000000"/>
+            </w:tcBorders>
+          </w:tcPr>
+          <w:p>
+            <w:pPr>
+              <w:pStyle w:val="Style19"/>
+              <w:widowControl/>
+              <w:pBdr/>
+              <w:bidi w:val="0"/>
+              <w:spacing w:before="75" w:after="75"/>
+              <w:ind w:hanging="0" w:start="0" w:end="0"/>
+              <w:jc w:val="start"/>
+              <w:rPr>
+                <w:rFonts w:ascii="Fira Code;monospace" w:hAnsi="Fira Code;monospace"/>
+                <w:b w:val="false"/>
+                <w:i w:val="false"/>
+                <w:caps w:val="false"/>
+                <w:smallCaps w:val="false"/>
+                <w:color w:val="2F2F37"/>
+                <w:spacing w:val="0"/>
+                <w:sz w:val="27"/>
+              </w:rPr>
+            </w:pPr>
+            <w:r>
+              <w:rPr>
+                <w:rFonts w:ascii="Fira Code;monospace" w:hAnsi="Fira Code;monospace"/>
+                <w:b w:val="false"/>
+                <w:i w:val="false"/>
+                <w:caps w:val="false"/>
+                <w:smallCaps w:val="false"/>
+                <w:color w:val="E6C07B"/>
+                <w:spacing w:val="0"/>
+                <w:sz w:val="27"/>
+              </w:rPr>
+              <w:t>array</w:t>
+            </w:r>
+            <w:r>
+              <w:rPr>
+                <w:rFonts w:ascii="Fira Code;monospace" w:hAnsi="Fira Code;monospace"/>
+                <w:b w:val="false"/>
+                <w:i w:val="false"/>
+                <w:caps w:val="false"/>
+                <w:smallCaps w:val="false"/>
+                <w:color w:val="2F2F37"/>
+                <w:spacing w:val="0"/>
+                <w:sz w:val="27"/>
+              </w:rPr>
+              <w:t xml:space="preserve">.some((element, index, </w:t>
+            </w:r>
+            <w:r>
+              <w:rPr>
+                <w:rFonts w:ascii="Fira Code;monospace" w:hAnsi="Fira Code;monospace"/>
+                <w:b w:val="false"/>
+                <w:i w:val="false"/>
+                <w:caps w:val="false"/>
+                <w:smallCaps w:val="false"/>
+                <w:color w:val="E6C07B"/>
+                <w:spacing w:val="0"/>
+                <w:sz w:val="27"/>
+              </w:rPr>
+              <w:t>array</w:t>
+            </w:r>
+            <w:r>
+              <w:rPr>
+                <w:rFonts w:ascii="Fira Code;monospace" w:hAnsi="Fira Code;monospace"/>
+                <w:b w:val="false"/>
+                <w:i w:val="false"/>
+                <w:caps w:val="false"/>
+                <w:smallCaps w:val="false"/>
+                <w:color w:val="2F2F37"/>
+                <w:spacing w:val="0"/>
+                <w:sz w:val="27"/>
+              </w:rPr>
+              <w:t>) =&gt; {</w:t>
+            </w:r>
+          </w:p>
+          <w:p>
+            <w:pPr>
+              <w:pStyle w:val="Style19"/>
+              <w:widowControl/>
+              <w:pBdr/>
+              <w:shd w:fill="E2E5E8" w:val="clear"/>
+              <w:bidi w:val="0"/>
+              <w:spacing w:before="75" w:after="75"/>
+              <w:ind w:hanging="0" w:start="0" w:end="0"/>
+              <w:jc w:val="start"/>
+              <w:rPr>
+                <w:rFonts w:ascii="Fira Code;monospace" w:hAnsi="Fira Code;monospace"/>
+                <w:caps w:val="false"/>
+                <w:smallCaps w:val="false"/>
+                <w:color w:val="2F2F37"/>
+                <w:spacing w:val="0"/>
+                <w:sz w:val="27"/>
+              </w:rPr>
+            </w:pPr>
+            <w:r>
+              <w:rPr>
+                <w:rFonts w:ascii="Fira Code;monospace" w:hAnsi="Fira Code;monospace"/>
+                <w:caps w:val="false"/>
+                <w:smallCaps w:val="false"/>
+                <w:color w:val="2F2F37"/>
+                <w:spacing w:val="0"/>
+                <w:sz w:val="27"/>
+              </w:rPr>
+              <w:t xml:space="preserve">  </w:t>
+            </w:r>
+            <w:r>
+              <w:rPr>
+                <w:rFonts w:ascii="Fira Code;monospace" w:hAnsi="Fira Code;monospace"/>
+                <w:b w:val="false"/>
+                <w:i/>
+                <w:caps w:val="false"/>
+                <w:smallCaps w:val="false"/>
+                <w:color w:val="5C6370"/>
+                <w:spacing w:val="0"/>
+                <w:sz w:val="27"/>
+              </w:rPr>
+              <w:t>// Тіло колбек-функції</w:t>
+            </w:r>
+          </w:p>
+          <w:p>
+            <w:pPr>
+              <w:pStyle w:val="Style19"/>
+              <w:widowControl/>
+              <w:pBdr/>
+              <w:shd w:fill="E2E5E8" w:val="clear"/>
+              <w:bidi w:val="0"/>
+              <w:spacing w:before="75" w:after="75"/>
+              <w:ind w:hanging="0" w:start="0" w:end="0"/>
+              <w:jc w:val="start"/>
+              <w:rPr>
+                <w:rFonts w:ascii="Fira Code;monospace" w:hAnsi="Fira Code;monospace"/>
+                <w:b w:val="false"/>
+                <w:i w:val="false"/>
+                <w:caps w:val="false"/>
+                <w:smallCaps w:val="false"/>
+                <w:color w:val="2F2F37"/>
+                <w:spacing w:val="0"/>
+                <w:sz w:val="27"/>
+              </w:rPr>
+            </w:pPr>
+            <w:r>
+              <w:rPr>
+                <w:rFonts w:ascii="Fira Code;monospace" w:hAnsi="Fira Code;monospace"/>
+                <w:b w:val="false"/>
+                <w:i w:val="false"/>
+                <w:caps w:val="false"/>
+                <w:smallCaps w:val="false"/>
+                <w:color w:val="2F2F37"/>
+                <w:spacing w:val="0"/>
+                <w:sz w:val="27"/>
+              </w:rPr>
+              <w:t>});</w:t>
+            </w:r>
+          </w:p>
+          <w:p>
+            <w:pPr>
+              <w:pStyle w:val="Style19"/>
+              <w:widowControl/>
+              <w:pBdr/>
+              <w:bidi w:val="0"/>
+              <w:spacing w:before="75" w:after="75"/>
+              <w:ind w:hanging="0" w:start="0" w:end="0"/>
+              <w:jc w:val="start"/>
+              <w:rPr>
+                <w:rFonts w:ascii="Fira Code;monospace" w:hAnsi="Fira Code;monospace"/>
+                <w:b w:val="false"/>
+                <w:i w:val="false"/>
+                <w:caps w:val="false"/>
+                <w:smallCaps w:val="false"/>
+                <w:color w:val="2F2F37"/>
+                <w:spacing w:val="0"/>
+                <w:sz w:val="27"/>
+              </w:rPr>
+            </w:pPr>
+            <w:r>
+              <w:rPr>
+                <w:rFonts w:ascii="Fira Code;monospace" w:hAnsi="Fira Code;monospace"/>
+                <w:b w:val="false"/>
+                <w:i w:val="false"/>
+                <w:caps w:val="false"/>
+                <w:smallCaps w:val="false"/>
+                <w:color w:val="2F2F37"/>
+                <w:spacing w:val="0"/>
+                <w:sz w:val="27"/>
+              </w:rPr>
+            </w:r>
+          </w:p>
+        </w:tc>
+        <w:tc>
+          <w:tcPr>
+            <w:tcW w:w="4321" w:type="dxa"/>
+            <w:tcBorders>
+              <w:start w:val="single" w:sz="4" w:space="0" w:color="000000"/>
+              <w:bottom w:val="single" w:sz="4" w:space="0" w:color="000000"/>
+              <w:end w:val="single" w:sz="4" w:space="0" w:color="000000"/>
+            </w:tcBorders>
+          </w:tcPr>
+          <w:p>
+            <w:pPr>
+              <w:pStyle w:val="BodyText"/>
+              <w:widowControl/>
+              <w:numPr>
+                <w:ilvl w:val="0"/>
+                <w:numId w:val="3"/>
+              </w:numPr>
+              <w:pBdr/>
+              <w:tabs>
+                <w:tab w:val="clear" w:pos="709"/>
+                <w:tab w:val="left" w:pos="0" w:leader="none"/>
+              </w:tabs>
+              <w:bidi w:val="0"/>
+              <w:spacing w:before="0" w:after="0"/>
+              <w:ind w:hanging="0" w:start="0" w:end="0"/>
+              <w:jc w:val="start"/>
+              <w:rPr/>
+            </w:pPr>
+            <w:r>
+              <w:rPr>
+                <w:rFonts w:ascii="Montserrat;apple-system;BlinkMacSystemFont;Segoe UI;Roboto;Oxygen;Ubuntu;Cantarell;Open Sans;Helvetica Neue;sans-serif" w:hAnsi="Montserrat;apple-system;BlinkMacSystemFont;Segoe UI;Roboto;Oxygen;Ubuntu;Cantarell;Open Sans;Helvetica Neue;sans-serif"/>
+                <w:b w:val="false"/>
+                <w:i w:val="false"/>
+                <w:caps w:val="false"/>
+                <w:smallCaps w:val="false"/>
+                <w:color w:val="2F2F37"/>
+                <w:spacing w:val="0"/>
+                <w:sz w:val="27"/>
+              </w:rPr>
+              <w:t>Метод </w:t>
+            </w:r>
+            <w:r>
+              <w:rPr>
+                <w:rStyle w:val="Style15"/>
+                <w:rFonts w:ascii="Fira Code;monospace" w:hAnsi="Fira Code;monospace"/>
+                <w:b w:val="false"/>
+                <w:i w:val="false"/>
+                <w:caps w:val="false"/>
+                <w:smallCaps w:val="false"/>
+                <w:color w:val="2F2F37"/>
+                <w:spacing w:val="0"/>
+                <w:shd w:fill="ECEFF1" w:val="clear"/>
+              </w:rPr>
+              <w:t>some(callback)</w:t>
+            </w:r>
+            <w:r>
+              <w:rPr>
+                <w:caps w:val="false"/>
+                <w:smallCaps w:val="false"/>
+                <w:color w:val="2F2F37"/>
+                <w:spacing w:val="0"/>
+              </w:rPr>
+              <w:t> </w:t>
+            </w:r>
+            <w:r>
+              <w:rPr>
+                <w:rFonts w:ascii="Montserrat;apple-system;BlinkMacSystemFont;Segoe UI;Roboto;Oxygen;Ubuntu;Cantarell;Open Sans;Helvetica Neue;sans-serif" w:hAnsi="Montserrat;apple-system;BlinkMacSystemFont;Segoe UI;Roboto;Oxygen;Ubuntu;Cantarell;Open Sans;Helvetica Neue;sans-serif"/>
+                <w:b w:val="false"/>
+                <w:i w:val="false"/>
+                <w:caps w:val="false"/>
+                <w:smallCaps w:val="false"/>
+                <w:color w:val="2F2F37"/>
+                <w:spacing w:val="0"/>
+                <w:sz w:val="27"/>
+              </w:rPr>
+              <w:t>перевіряє, чи задовольняє </w:t>
+            </w:r>
+            <w:r>
+              <w:rPr>
+                <w:rStyle w:val="Strong"/>
+                <w:rFonts w:ascii="Montserrat;apple-system;BlinkMacSystemFont;Segoe UI;Roboto;Oxygen;Ubuntu;Cantarell;Open Sans;Helvetica Neue;sans-serif" w:hAnsi="Montserrat;apple-system;BlinkMacSystemFont;Segoe UI;Roboto;Oxygen;Ubuntu;Cantarell;Open Sans;Helvetica Neue;sans-serif"/>
+                <w:b w:val="false"/>
+                <w:i w:val="false"/>
+                <w:caps w:val="false"/>
+                <w:smallCaps w:val="false"/>
+                <w:color w:val="2F2F37"/>
+                <w:spacing w:val="0"/>
+                <w:sz w:val="27"/>
+              </w:rPr>
+              <w:t>хоча б один елемент</w:t>
+            </w:r>
+            <w:r>
+              <w:rPr>
+                <w:caps w:val="false"/>
+                <w:smallCaps w:val="false"/>
+                <w:color w:val="2F2F37"/>
+                <w:spacing w:val="0"/>
+              </w:rPr>
+              <w:t> </w:t>
+            </w:r>
+            <w:r>
+              <w:rPr>
+                <w:rFonts w:ascii="Montserrat;apple-system;BlinkMacSystemFont;Segoe UI;Roboto;Oxygen;Ubuntu;Cantarell;Open Sans;Helvetica Neue;sans-serif" w:hAnsi="Montserrat;apple-system;BlinkMacSystemFont;Segoe UI;Roboto;Oxygen;Ubuntu;Cantarell;Open Sans;Helvetica Neue;sans-serif"/>
+                <w:b w:val="false"/>
+                <w:i w:val="false"/>
+                <w:caps w:val="false"/>
+                <w:smallCaps w:val="false"/>
+                <w:color w:val="2F2F37"/>
+                <w:spacing w:val="0"/>
+                <w:sz w:val="27"/>
+              </w:rPr>
+              <w:t>умову колбек-функції.</w:t>
+            </w:r>
+          </w:p>
+          <w:p>
+            <w:pPr>
+              <w:pStyle w:val="BodyText"/>
+              <w:widowControl/>
+              <w:numPr>
+                <w:ilvl w:val="0"/>
+                <w:numId w:val="3"/>
+              </w:numPr>
+              <w:pBdr/>
+              <w:tabs>
+                <w:tab w:val="clear" w:pos="709"/>
+                <w:tab w:val="left" w:pos="0" w:leader="none"/>
+              </w:tabs>
+              <w:bidi w:val="0"/>
+              <w:spacing w:before="0" w:after="0"/>
+              <w:ind w:hanging="0" w:start="0" w:end="0"/>
+              <w:jc w:val="start"/>
+              <w:rPr>
+                <w:rFonts w:ascii="Montserrat;apple-system;BlinkMacSystemFont;Segoe UI;Roboto;Oxygen;Ubuntu;Cantarell;Open Sans;Helvetica Neue;sans-serif" w:hAnsi="Montserrat;apple-system;BlinkMacSystemFont;Segoe UI;Roboto;Oxygen;Ubuntu;Cantarell;Open Sans;Helvetica Neue;sans-serif"/>
+                <w:b w:val="false"/>
+                <w:i w:val="false"/>
+                <w:caps w:val="false"/>
+                <w:smallCaps w:val="false"/>
+                <w:color w:val="2F2F37"/>
+                <w:spacing w:val="0"/>
+                <w:sz w:val="27"/>
+              </w:rPr>
+            </w:pPr>
+            <w:r>
+              <w:rPr>
+                <w:rFonts w:ascii="Montserrat;apple-system;BlinkMacSystemFont;Segoe UI;Roboto;Oxygen;Ubuntu;Cantarell;Open Sans;Helvetica Neue;sans-serif" w:hAnsi="Montserrat;apple-system;BlinkMacSystemFont;Segoe UI;Roboto;Oxygen;Ubuntu;Cantarell;Open Sans;Helvetica Neue;sans-serif"/>
+                <w:b w:val="false"/>
+                <w:i w:val="false"/>
+                <w:caps w:val="false"/>
+                <w:smallCaps w:val="false"/>
+                <w:color w:val="2F2F37"/>
+                <w:spacing w:val="0"/>
+                <w:sz w:val="27"/>
+              </w:rPr>
+              <w:t>Не змінює оригінальний масив</w:t>
+            </w:r>
+          </w:p>
+          <w:p>
+            <w:pPr>
+              <w:pStyle w:val="BodyText"/>
+              <w:widowControl/>
+              <w:numPr>
+                <w:ilvl w:val="0"/>
+                <w:numId w:val="4"/>
+              </w:numPr>
+              <w:pBdr/>
+              <w:tabs>
+                <w:tab w:val="clear" w:pos="709"/>
+                <w:tab w:val="left" w:pos="0" w:leader="none"/>
+              </w:tabs>
+              <w:bidi w:val="0"/>
+              <w:spacing w:before="0" w:after="0"/>
+              <w:ind w:hanging="0" w:start="0" w:end="0"/>
+              <w:jc w:val="start"/>
+              <w:rPr>
+                <w:rFonts w:ascii="Montserrat;apple-system;BlinkMacSystemFont;Segoe UI;Roboto;Oxygen;Ubuntu;Cantarell;Open Sans;Helvetica Neue;sans-serif" w:hAnsi="Montserrat;apple-system;BlinkMacSystemFont;Segoe UI;Roboto;Oxygen;Ubuntu;Cantarell;Open Sans;Helvetica Neue;sans-serif"/>
+                <w:b w:val="false"/>
+                <w:i w:val="false"/>
+                <w:caps w:val="false"/>
+                <w:smallCaps w:val="false"/>
+                <w:color w:val="2F2F37"/>
+                <w:spacing w:val="0"/>
+                <w:sz w:val="27"/>
+              </w:rPr>
+            </w:pPr>
+            <w:r>
+              <w:rPr>
+                <w:rFonts w:ascii="Montserrat;apple-system;BlinkMacSystemFont;Segoe UI;Roboto;Oxygen;Ubuntu;Cantarell;Open Sans;Helvetica Neue;sans-serif" w:hAnsi="Montserrat;apple-system;BlinkMacSystemFont;Segoe UI;Roboto;Oxygen;Ubuntu;Cantarell;Open Sans;Helvetica Neue;sans-serif"/>
+                <w:b w:val="false"/>
+                <w:i w:val="false"/>
+                <w:caps w:val="false"/>
+                <w:smallCaps w:val="false"/>
+                <w:color w:val="2F2F37"/>
+                <w:spacing w:val="0"/>
+                <w:sz w:val="27"/>
+              </w:rPr>
+              <w:t>Поелементно перебирає оригінальний масив</w:t>
+            </w:r>
+          </w:p>
+          <w:p>
+            <w:pPr>
+              <w:pStyle w:val="BodyText"/>
+              <w:widowControl/>
+              <w:numPr>
+                <w:ilvl w:val="0"/>
+                <w:numId w:val="4"/>
+              </w:numPr>
+              <w:pBdr/>
+              <w:tabs>
+                <w:tab w:val="clear" w:pos="709"/>
+                <w:tab w:val="left" w:pos="0" w:leader="none"/>
+              </w:tabs>
+              <w:bidi w:val="0"/>
+              <w:spacing w:before="0" w:after="0"/>
+              <w:ind w:hanging="0" w:start="0" w:end="0"/>
+              <w:jc w:val="start"/>
+              <w:rPr>
+                <w:rFonts w:ascii="Montserrat;apple-system;BlinkMacSystemFont;Segoe UI;Roboto;Oxygen;Ubuntu;Cantarell;Open Sans;Helvetica Neue;sans-serif" w:hAnsi="Montserrat;apple-system;BlinkMacSystemFont;Segoe UI;Roboto;Oxygen;Ubuntu;Cantarell;Open Sans;Helvetica Neue;sans-serif"/>
+                <w:color w:val="2F2F37"/>
+                <w:sz w:val="27"/>
+              </w:rPr>
+            </w:pPr>
+            <w:r>
+              <w:rPr>
+                <w:rFonts w:ascii="Montserrat;apple-system;BlinkMacSystemFont;Segoe UI;Roboto;Oxygen;Ubuntu;Cantarell;Open Sans;Helvetica Neue;sans-serif" w:hAnsi="Montserrat;apple-system;BlinkMacSystemFont;Segoe UI;Roboto;Oxygen;Ubuntu;Cantarell;Open Sans;Helvetica Neue;sans-serif"/>
+                <w:b w:val="false"/>
+                <w:i w:val="false"/>
+                <w:caps w:val="false"/>
+                <w:smallCaps w:val="false"/>
+                <w:color w:val="2F2F37"/>
+                <w:spacing w:val="0"/>
+                <w:sz w:val="27"/>
+              </w:rPr>
+              <w:t>Повертає </w:t>
+            </w:r>
+            <w:r>
+              <w:rPr>
+                <w:rStyle w:val="Style15"/>
+                <w:rFonts w:ascii="Fira Code;monospace" w:hAnsi="Fira Code;monospace"/>
+                <w:b w:val="false"/>
+                <w:i w:val="false"/>
+                <w:caps w:val="false"/>
+                <w:smallCaps w:val="false"/>
+                <w:color w:val="2F2F37"/>
+                <w:spacing w:val="0"/>
+                <w:sz w:val="27"/>
+                <w:shd w:fill="ECEFF1" w:val="clear"/>
+              </w:rPr>
+              <w:t>true</w:t>
+            </w:r>
+            <w:r>
+              <w:rPr>
+                <w:rFonts w:ascii="Montserrat;apple-system;BlinkMacSystemFont;Segoe UI;Roboto;Oxygen;Ubuntu;Cantarell;Open Sans;Helvetica Neue;sans-serif" w:hAnsi="Montserrat;apple-system;BlinkMacSystemFont;Segoe UI;Roboto;Oxygen;Ubuntu;Cantarell;Open Sans;Helvetica Neue;sans-serif"/>
+                <w:b w:val="false"/>
+                <w:i w:val="false"/>
+                <w:caps w:val="false"/>
+                <w:smallCaps w:val="false"/>
+                <w:color w:val="2F2F37"/>
+                <w:spacing w:val="0"/>
+                <w:sz w:val="27"/>
+              </w:rPr>
+              <w:t>, якщо хоча б один елемент масиву задовольняє умову</w:t>
+            </w:r>
+          </w:p>
+          <w:p>
+            <w:pPr>
+              <w:pStyle w:val="BodyText"/>
+              <w:widowControl/>
+              <w:numPr>
+                <w:ilvl w:val="0"/>
+                <w:numId w:val="4"/>
+              </w:numPr>
+              <w:pBdr/>
+              <w:tabs>
+                <w:tab w:val="clear" w:pos="709"/>
+                <w:tab w:val="left" w:pos="0" w:leader="none"/>
+              </w:tabs>
+              <w:bidi w:val="0"/>
+              <w:spacing w:before="0" w:after="0"/>
+              <w:ind w:hanging="0" w:start="0" w:end="0"/>
+              <w:jc w:val="start"/>
+              <w:rPr>
+                <w:rFonts w:ascii="Montserrat;apple-system;BlinkMacSystemFont;Segoe UI;Roboto;Oxygen;Ubuntu;Cantarell;Open Sans;Helvetica Neue;sans-serif" w:hAnsi="Montserrat;apple-system;BlinkMacSystemFont;Segoe UI;Roboto;Oxygen;Ubuntu;Cantarell;Open Sans;Helvetica Neue;sans-serif"/>
+                <w:color w:val="2F2F37"/>
+                <w:sz w:val="27"/>
+              </w:rPr>
+            </w:pPr>
+            <w:r>
+              <w:rPr>
+                <w:rFonts w:ascii="Montserrat;apple-system;BlinkMacSystemFont;Segoe UI;Roboto;Oxygen;Ubuntu;Cantarell;Open Sans;Helvetica Neue;sans-serif" w:hAnsi="Montserrat;apple-system;BlinkMacSystemFont;Segoe UI;Roboto;Oxygen;Ubuntu;Cantarell;Open Sans;Helvetica Neue;sans-serif"/>
+                <w:b w:val="false"/>
+                <w:i w:val="false"/>
+                <w:caps w:val="false"/>
+                <w:smallCaps w:val="false"/>
+                <w:color w:val="2F2F37"/>
+                <w:spacing w:val="0"/>
+                <w:sz w:val="27"/>
+              </w:rPr>
+              <w:t>Повертає </w:t>
+            </w:r>
+            <w:r>
+              <w:rPr>
+                <w:rStyle w:val="Style15"/>
+                <w:rFonts w:ascii="Fira Code;monospace" w:hAnsi="Fira Code;monospace"/>
+                <w:b w:val="false"/>
+                <w:i w:val="false"/>
+                <w:caps w:val="false"/>
+                <w:smallCaps w:val="false"/>
+                <w:color w:val="2F2F37"/>
+                <w:spacing w:val="0"/>
+                <w:sz w:val="27"/>
+                <w:shd w:fill="ECEFF1" w:val="clear"/>
+              </w:rPr>
+              <w:t>false</w:t>
+            </w:r>
+            <w:r>
+              <w:rPr>
+                <w:rFonts w:ascii="Montserrat;apple-system;BlinkMacSystemFont;Segoe UI;Roboto;Oxygen;Ubuntu;Cantarell;Open Sans;Helvetica Neue;sans-serif" w:hAnsi="Montserrat;apple-system;BlinkMacSystemFont;Segoe UI;Roboto;Oxygen;Ubuntu;Cantarell;Open Sans;Helvetica Neue;sans-serif"/>
+                <w:b w:val="false"/>
+                <w:i w:val="false"/>
+                <w:caps w:val="false"/>
+                <w:smallCaps w:val="false"/>
+                <w:color w:val="2F2F37"/>
+                <w:spacing w:val="0"/>
+                <w:sz w:val="27"/>
+              </w:rPr>
+              <w:t>, якщо жоден елемент масиву не задовольняє умову</w:t>
+            </w:r>
+          </w:p>
+          <w:p>
+            <w:pPr>
+              <w:pStyle w:val="BodyText"/>
+              <w:widowControl/>
+              <w:numPr>
+                <w:ilvl w:val="0"/>
+                <w:numId w:val="4"/>
+              </w:numPr>
+              <w:pBdr/>
+              <w:tabs>
+                <w:tab w:val="clear" w:pos="709"/>
+                <w:tab w:val="left" w:pos="0" w:leader="none"/>
+              </w:tabs>
+              <w:bidi w:val="0"/>
+              <w:spacing w:before="0" w:after="0"/>
+              <w:ind w:hanging="0" w:start="0" w:end="0"/>
+              <w:jc w:val="start"/>
+              <w:rPr>
+                <w:rFonts w:ascii="Montserrat;apple-system;BlinkMacSystemFont;Segoe UI;Roboto;Oxygen;Ubuntu;Cantarell;Open Sans;Helvetica Neue;sans-serif" w:hAnsi="Montserrat;apple-system;BlinkMacSystemFont;Segoe UI;Roboto;Oxygen;Ubuntu;Cantarell;Open Sans;Helvetica Neue;sans-serif"/>
+                <w:color w:val="2F2F37"/>
+                <w:sz w:val="27"/>
+              </w:rPr>
+            </w:pPr>
+            <w:r>
+              <w:rPr>
+                <w:rFonts w:ascii="Montserrat;apple-system;BlinkMacSystemFont;Segoe UI;Roboto;Oxygen;Ubuntu;Cantarell;Open Sans;Helvetica Neue;sans-serif" w:hAnsi="Montserrat;apple-system;BlinkMacSystemFont;Segoe UI;Roboto;Oxygen;Ubuntu;Cantarell;Open Sans;Helvetica Neue;sans-serif"/>
+                <w:b w:val="false"/>
+                <w:i w:val="false"/>
+                <w:caps w:val="false"/>
+                <w:smallCaps w:val="false"/>
+                <w:color w:val="2F2F37"/>
+                <w:spacing w:val="0"/>
+                <w:sz w:val="27"/>
+              </w:rPr>
+              <w:t>Перебирання масиву припиняється, якщо колбек повертає </w:t>
+            </w:r>
+            <w:r>
+              <w:rPr>
+                <w:rStyle w:val="Style15"/>
+                <w:rFonts w:ascii="Fira Code;monospace" w:hAnsi="Fira Code;monospace"/>
+                <w:b w:val="false"/>
+                <w:i w:val="false"/>
+                <w:caps w:val="false"/>
+                <w:smallCaps w:val="false"/>
+                <w:color w:val="2F2F37"/>
+                <w:spacing w:val="0"/>
+                <w:sz w:val="27"/>
+                <w:shd w:fill="ECEFF1" w:val="clear"/>
+              </w:rPr>
+              <w:t>true</w:t>
+            </w:r>
+          </w:p>
+          <w:p>
+            <w:pPr>
+              <w:pStyle w:val="BodyText"/>
+              <w:widowControl/>
+              <w:numPr>
+                <w:ilvl w:val="6"/>
+                <w:numId w:val="3"/>
+              </w:numPr>
+              <w:pBdr/>
+              <w:tabs>
+                <w:tab w:val="clear" w:pos="709"/>
+                <w:tab w:val="left" w:pos="4963" w:leader="none"/>
+              </w:tabs>
+              <w:bidi w:val="0"/>
+              <w:spacing w:before="0" w:after="0"/>
+              <w:ind w:hanging="283" w:start="4963" w:end="0"/>
+              <w:jc w:val="start"/>
+              <w:rPr>
+                <w:rFonts w:ascii="Montserrat;apple-system;BlinkMacSystemFont;Segoe UI;Roboto;Oxygen;Ubuntu;Cantarell;Open Sans;Helvetica Neue;sans-serif" w:hAnsi="Montserrat;apple-system;BlinkMacSystemFont;Segoe UI;Roboto;Oxygen;Ubuntu;Cantarell;Open Sans;Helvetica Neue;sans-serif"/>
+                <w:b w:val="false"/>
+                <w:i w:val="false"/>
+                <w:caps w:val="false"/>
+                <w:smallCaps w:val="false"/>
+                <w:color w:val="2F2F37"/>
+                <w:spacing w:val="0"/>
+                <w:sz w:val="27"/>
+              </w:rPr>
+            </w:pPr>
+            <w:r>
+              <w:rPr>
+                <w:rFonts w:ascii="Montserrat;apple-system;BlinkMacSystemFont;Segoe UI;Roboto;Oxygen;Ubuntu;Cantarell;Open Sans;Helvetica Neue;sans-serif" w:hAnsi="Montserrat;apple-system;BlinkMacSystemFont;Segoe UI;Roboto;Oxygen;Ubuntu;Cantarell;Open Sans;Helvetica Neue;sans-serif"/>
+                <w:b w:val="false"/>
+                <w:i w:val="false"/>
+                <w:caps w:val="false"/>
+                <w:smallCaps w:val="false"/>
+                <w:color w:val="2F2F37"/>
+                <w:spacing w:val="0"/>
+                <w:sz w:val="27"/>
+              </w:rPr>
+            </w:r>
+          </w:p>
+        </w:tc>
+      </w:tr>
+      <w:tr>
+        <w:trPr/>
+        <w:tc>
+          <w:tcPr>
+            <w:tcW w:w="1753" w:type="dxa"/>
+            <w:tcBorders>
+              <w:start w:val="single" w:sz="4" w:space="0" w:color="000000"/>
+              <w:bottom w:val="single" w:sz="4" w:space="0" w:color="000000"/>
+            </w:tcBorders>
+          </w:tcPr>
+          <w:p>
+            <w:pPr>
+              <w:pStyle w:val="Style18"/>
+              <w:bidi w:val="0"/>
+              <w:jc w:val="start"/>
+              <w:rPr/>
+            </w:pPr>
+            <w:r>
+              <w:rPr>
+                <w:rStyle w:val="Strong"/>
+                <w:rFonts w:ascii="Montserrat;apple-system;BlinkMacSystemFont;Segoe UI;Roboto;Oxygen;Ubuntu;Cantarell;Open Sans;Helvetica Neue;sans-serif" w:hAnsi="Montserrat;apple-system;BlinkMacSystemFont;Segoe UI;Roboto;Oxygen;Ubuntu;Cantarell;Open Sans;Helvetica Neue;sans-serif"/>
+                <w:b w:val="false"/>
+                <w:i w:val="false"/>
+                <w:caps w:val="false"/>
+                <w:smallCaps w:val="false"/>
+                <w:color w:val="2F2F37"/>
+                <w:spacing w:val="0"/>
+                <w:sz w:val="36"/>
+              </w:rPr>
+              <w:t>Метод </w:t>
+            </w:r>
+            <w:r>
+              <w:rPr>
+                <w:rStyle w:val="Strong"/>
+                <w:rFonts w:ascii="Fira Code;monospace" w:hAnsi="Fira Code;monospace"/>
+                <w:b/>
+                <w:i w:val="false"/>
+                <w:caps w:val="false"/>
+                <w:smallCaps w:val="false"/>
+                <w:color w:val="2F2F37"/>
+                <w:spacing w:val="0"/>
+                <w:sz w:val="36"/>
+                <w:shd w:fill="ECEFF1" w:val="clear"/>
+              </w:rPr>
+              <w:t>reduce()</w:t>
+            </w:r>
+          </w:p>
+        </w:tc>
+        <w:tc>
+          <w:tcPr>
+            <w:tcW w:w="3564" w:type="dxa"/>
+            <w:tcBorders>
+              <w:start w:val="single" w:sz="4" w:space="0" w:color="000000"/>
+              <w:bottom w:val="single" w:sz="4" w:space="0" w:color="000000"/>
+            </w:tcBorders>
+          </w:tcPr>
+          <w:p>
+            <w:pPr>
+              <w:pStyle w:val="Style19"/>
+              <w:widowControl/>
+              <w:pBdr/>
+              <w:bidi w:val="0"/>
+              <w:spacing w:before="75" w:after="75"/>
+              <w:ind w:hanging="0" w:start="0" w:end="0"/>
+              <w:jc w:val="start"/>
+              <w:rPr>
+                <w:rFonts w:ascii="Fira Code;monospace" w:hAnsi="Fira Code;monospace"/>
+                <w:b w:val="false"/>
+                <w:i w:val="false"/>
+                <w:caps w:val="false"/>
+                <w:smallCaps w:val="false"/>
+                <w:color w:val="2F2F37"/>
+                <w:spacing w:val="0"/>
+                <w:sz w:val="27"/>
+              </w:rPr>
+            </w:pPr>
+            <w:r>
+              <w:rPr>
+                <w:rFonts w:ascii="Fira Code;monospace" w:hAnsi="Fira Code;monospace"/>
+                <w:b w:val="false"/>
+                <w:i w:val="false"/>
+                <w:caps w:val="false"/>
+                <w:smallCaps w:val="false"/>
+                <w:color w:val="E6C07B"/>
+                <w:spacing w:val="0"/>
+                <w:sz w:val="27"/>
+              </w:rPr>
+              <w:t>array</w:t>
+            </w:r>
+            <w:r>
+              <w:rPr>
+                <w:rFonts w:ascii="Fira Code;monospace" w:hAnsi="Fira Code;monospace"/>
+                <w:b w:val="false"/>
+                <w:i w:val="false"/>
+                <w:caps w:val="false"/>
+                <w:smallCaps w:val="false"/>
+                <w:color w:val="2F2F37"/>
+                <w:spacing w:val="0"/>
+                <w:sz w:val="27"/>
+              </w:rPr>
+              <w:t>.</w:t>
+            </w:r>
+            <w:r>
+              <w:rPr>
+                <w:rFonts w:ascii="Fira Code;monospace" w:hAnsi="Fira Code;monospace"/>
+                <w:b w:val="false"/>
+                <w:i w:val="false"/>
+                <w:caps w:val="false"/>
+                <w:smallCaps w:val="false"/>
+                <w:color w:val="E6C07B"/>
+                <w:spacing w:val="0"/>
+                <w:sz w:val="27"/>
+              </w:rPr>
+              <w:t>reduce</w:t>
+            </w:r>
+            <w:r>
+              <w:rPr>
+                <w:rFonts w:ascii="Fira Code;monospace" w:hAnsi="Fira Code;monospace"/>
+                <w:b w:val="false"/>
+                <w:i w:val="false"/>
+                <w:caps w:val="false"/>
+                <w:smallCaps w:val="false"/>
+                <w:color w:val="2F2F37"/>
+                <w:spacing w:val="0"/>
+                <w:sz w:val="27"/>
+              </w:rPr>
+              <w:t xml:space="preserve">((previousValue, element, index, </w:t>
+            </w:r>
+            <w:r>
+              <w:rPr>
+                <w:rFonts w:ascii="Fira Code;monospace" w:hAnsi="Fira Code;monospace"/>
+                <w:b w:val="false"/>
+                <w:i w:val="false"/>
+                <w:caps w:val="false"/>
+                <w:smallCaps w:val="false"/>
+                <w:color w:val="E6C07B"/>
+                <w:spacing w:val="0"/>
+                <w:sz w:val="27"/>
+              </w:rPr>
+              <w:t>array</w:t>
+            </w:r>
+            <w:r>
+              <w:rPr>
+                <w:rFonts w:ascii="Fira Code;monospace" w:hAnsi="Fira Code;monospace"/>
+                <w:b w:val="false"/>
+                <w:i w:val="false"/>
+                <w:caps w:val="false"/>
+                <w:smallCaps w:val="false"/>
+                <w:color w:val="2F2F37"/>
+                <w:spacing w:val="0"/>
+                <w:sz w:val="27"/>
+              </w:rPr>
+              <w:t>) =&gt; {</w:t>
+            </w:r>
+          </w:p>
+          <w:p>
+            <w:pPr>
+              <w:pStyle w:val="Style19"/>
+              <w:widowControl/>
+              <w:pBdr/>
+              <w:shd w:fill="E2E5E8" w:val="clear"/>
+              <w:bidi w:val="0"/>
+              <w:spacing w:before="75" w:after="75"/>
+              <w:ind w:hanging="0" w:start="0" w:end="0"/>
+              <w:jc w:val="start"/>
+              <w:rPr>
+                <w:rFonts w:ascii="Fira Code;monospace" w:hAnsi="Fira Code;monospace"/>
+                <w:caps w:val="false"/>
+                <w:smallCaps w:val="false"/>
+                <w:color w:val="2F2F37"/>
+                <w:spacing w:val="0"/>
+                <w:sz w:val="27"/>
+              </w:rPr>
+            </w:pPr>
+            <w:r>
+              <w:rPr>
+                <w:rFonts w:ascii="Fira Code;monospace" w:hAnsi="Fira Code;monospace"/>
+                <w:caps w:val="false"/>
+                <w:smallCaps w:val="false"/>
+                <w:color w:val="2F2F37"/>
+                <w:spacing w:val="0"/>
+                <w:sz w:val="27"/>
+              </w:rPr>
+              <w:t xml:space="preserve">  </w:t>
+            </w:r>
+            <w:r>
+              <w:rPr>
+                <w:rFonts w:ascii="Fira Code;monospace" w:hAnsi="Fira Code;monospace"/>
+                <w:b w:val="false"/>
+                <w:i/>
+                <w:caps w:val="false"/>
+                <w:smallCaps w:val="false"/>
+                <w:color w:val="5C6370"/>
+                <w:spacing w:val="0"/>
+                <w:sz w:val="27"/>
+              </w:rPr>
+              <w:t>// Тіло колбек-функції</w:t>
+            </w:r>
+          </w:p>
+          <w:p>
+            <w:pPr>
+              <w:pStyle w:val="Style19"/>
+              <w:widowControl/>
+              <w:pBdr/>
+              <w:shd w:fill="E2E5E8" w:val="clear"/>
+              <w:bidi w:val="0"/>
+              <w:spacing w:before="75" w:after="75"/>
+              <w:ind w:hanging="0" w:start="0" w:end="0"/>
+              <w:jc w:val="start"/>
+              <w:rPr>
+                <w:rFonts w:ascii="Fira Code;monospace" w:hAnsi="Fira Code;monospace"/>
+                <w:b w:val="false"/>
+                <w:i w:val="false"/>
+                <w:caps w:val="false"/>
+                <w:smallCaps w:val="false"/>
+                <w:color w:val="2F2F37"/>
+                <w:spacing w:val="0"/>
+                <w:sz w:val="27"/>
+              </w:rPr>
+            </w:pPr>
+            <w:r>
+              <w:rPr>
+                <w:rFonts w:ascii="Fira Code;monospace" w:hAnsi="Fira Code;monospace"/>
+                <w:b w:val="false"/>
+                <w:i w:val="false"/>
+                <w:caps w:val="false"/>
+                <w:smallCaps w:val="false"/>
+                <w:color w:val="2F2F37"/>
+                <w:spacing w:val="0"/>
+                <w:sz w:val="27"/>
+              </w:rPr>
+              <w:t>}, initialValue);</w:t>
+            </w:r>
+          </w:p>
+          <w:p>
+            <w:pPr>
+              <w:pStyle w:val="Style19"/>
+              <w:widowControl/>
+              <w:pBdr/>
+              <w:bidi w:val="0"/>
+              <w:spacing w:before="75" w:after="75"/>
+              <w:ind w:hanging="0" w:start="0" w:end="0"/>
+              <w:jc w:val="start"/>
+              <w:rPr>
+                <w:rFonts w:ascii="Fira Code;monospace" w:hAnsi="Fira Code;monospace"/>
+                <w:b w:val="false"/>
+                <w:i w:val="false"/>
+                <w:caps w:val="false"/>
+                <w:smallCaps w:val="false"/>
+                <w:color w:val="2F2F37"/>
+                <w:spacing w:val="0"/>
+                <w:sz w:val="27"/>
+              </w:rPr>
+            </w:pPr>
+            <w:r>
+              <w:rPr>
+                <w:rFonts w:ascii="Fira Code;monospace" w:hAnsi="Fira Code;monospace"/>
+                <w:b w:val="false"/>
+                <w:i w:val="false"/>
+                <w:caps w:val="false"/>
+                <w:smallCaps w:val="false"/>
+                <w:color w:val="2F2F37"/>
+                <w:spacing w:val="0"/>
+                <w:sz w:val="27"/>
+              </w:rPr>
+            </w:r>
+          </w:p>
+        </w:tc>
+        <w:tc>
+          <w:tcPr>
+            <w:tcW w:w="4321" w:type="dxa"/>
+            <w:tcBorders>
+              <w:start w:val="single" w:sz="4" w:space="0" w:color="000000"/>
+              <w:bottom w:val="single" w:sz="4" w:space="0" w:color="000000"/>
+              <w:end w:val="single" w:sz="4" w:space="0" w:color="000000"/>
+            </w:tcBorders>
+          </w:tcPr>
+          <w:p>
+            <w:pPr>
+              <w:pStyle w:val="BodyText"/>
+              <w:widowControl/>
+              <w:numPr>
+                <w:ilvl w:val="0"/>
+                <w:numId w:val="3"/>
+              </w:numPr>
+              <w:pBdr/>
+              <w:tabs>
+                <w:tab w:val="clear" w:pos="709"/>
+                <w:tab w:val="left" w:pos="0" w:leader="none"/>
+              </w:tabs>
+              <w:bidi w:val="0"/>
+              <w:spacing w:before="0" w:after="0"/>
+              <w:ind w:hanging="0" w:start="0" w:end="0"/>
+              <w:jc w:val="start"/>
+              <w:rPr/>
+            </w:pPr>
+            <w:r>
+              <w:rPr>
+                <w:rFonts w:ascii="Montserrat;apple-system;BlinkMacSystemFont;Segoe UI;Roboto;Oxygen;Ubuntu;Cantarell;Open Sans;Helvetica Neue;sans-serif" w:hAnsi="Montserrat;apple-system;BlinkMacSystemFont;Segoe UI;Roboto;Oxygen;Ubuntu;Cantarell;Open Sans;Helvetica Neue;sans-serif"/>
+                <w:b w:val="false"/>
+                <w:i w:val="false"/>
+                <w:caps w:val="false"/>
+                <w:smallCaps w:val="false"/>
+                <w:color w:val="2F2F37"/>
+                <w:spacing w:val="0"/>
+                <w:sz w:val="27"/>
+              </w:rPr>
+              <w:t>Метод </w:t>
+            </w:r>
+            <w:r>
+              <w:rPr>
+                <w:rStyle w:val="Style15"/>
+                <w:rFonts w:ascii="Fira Code;monospace" w:hAnsi="Fira Code;monospace"/>
+                <w:b w:val="false"/>
+                <w:i w:val="false"/>
+                <w:caps w:val="false"/>
+                <w:smallCaps w:val="false"/>
+                <w:color w:val="2F2F37"/>
+                <w:spacing w:val="0"/>
+                <w:shd w:fill="ECEFF1" w:val="clear"/>
+              </w:rPr>
+              <w:t>reduce(callback, initialValue)</w:t>
+            </w:r>
+            <w:r>
+              <w:rPr>
+                <w:caps w:val="false"/>
+                <w:smallCaps w:val="false"/>
+                <w:color w:val="2F2F37"/>
+                <w:spacing w:val="0"/>
+              </w:rPr>
+              <w:t> </w:t>
+            </w:r>
+            <w:r>
+              <w:rPr>
+                <w:rFonts w:ascii="Montserrat;apple-system;BlinkMacSystemFont;Segoe UI;Roboto;Oxygen;Ubuntu;Cantarell;Open Sans;Helvetica Neue;sans-serif" w:hAnsi="Montserrat;apple-system;BlinkMacSystemFont;Segoe UI;Roboto;Oxygen;Ubuntu;Cantarell;Open Sans;Helvetica Neue;sans-serif"/>
+                <w:b w:val="false"/>
+                <w:i w:val="false"/>
+                <w:caps w:val="false"/>
+                <w:smallCaps w:val="false"/>
+                <w:color w:val="2F2F37"/>
+                <w:spacing w:val="0"/>
+                <w:sz w:val="27"/>
+              </w:rPr>
+              <w:t>використовується для послідовної обробки кожного елемента масиву із збереженням проміжного результату.</w:t>
+            </w:r>
+          </w:p>
+          <w:p>
+            <w:pPr>
+              <w:pStyle w:val="BodyText"/>
+              <w:widowControl/>
+              <w:numPr>
+                <w:ilvl w:val="0"/>
+                <w:numId w:val="3"/>
+              </w:numPr>
+              <w:pBdr/>
+              <w:tabs>
+                <w:tab w:val="clear" w:pos="709"/>
+                <w:tab w:val="left" w:pos="0" w:leader="none"/>
+              </w:tabs>
+              <w:bidi w:val="0"/>
+              <w:spacing w:before="0" w:after="0"/>
+              <w:ind w:hanging="0" w:start="0" w:end="0"/>
+              <w:jc w:val="start"/>
+              <w:rPr>
+                <w:rFonts w:ascii="Montserrat;apple-system;BlinkMacSystemFont;Segoe UI;Roboto;Oxygen;Ubuntu;Cantarell;Open Sans;Helvetica Neue;sans-serif" w:hAnsi="Montserrat;apple-system;BlinkMacSystemFont;Segoe UI;Roboto;Oxygen;Ubuntu;Cantarell;Open Sans;Helvetica Neue;sans-serif"/>
+                <w:b w:val="false"/>
+                <w:i w:val="false"/>
+                <w:caps w:val="false"/>
+                <w:smallCaps w:val="false"/>
+                <w:color w:val="2F2F37"/>
+                <w:spacing w:val="0"/>
+                <w:sz w:val="27"/>
+              </w:rPr>
+            </w:pPr>
+            <w:r>
+              <w:rPr>
+                <w:rFonts w:ascii="Montserrat;apple-system;BlinkMacSystemFont;Segoe UI;Roboto;Oxygen;Ubuntu;Cantarell;Open Sans;Helvetica Neue;sans-serif" w:hAnsi="Montserrat;apple-system;BlinkMacSystemFont;Segoe UI;Roboto;Oxygen;Ubuntu;Cantarell;Open Sans;Helvetica Neue;sans-serif"/>
+                <w:b w:val="false"/>
+                <w:i w:val="false"/>
+                <w:caps w:val="false"/>
+                <w:smallCaps w:val="false"/>
+                <w:color w:val="2F2F37"/>
+                <w:spacing w:val="0"/>
+                <w:sz w:val="27"/>
+              </w:rPr>
+              <w:t>Не змінює оригінальний масив</w:t>
+            </w:r>
+          </w:p>
+          <w:p>
+            <w:pPr>
+              <w:pStyle w:val="BodyText"/>
+              <w:widowControl/>
+              <w:numPr>
+                <w:ilvl w:val="0"/>
+                <w:numId w:val="5"/>
+              </w:numPr>
+              <w:pBdr/>
+              <w:tabs>
+                <w:tab w:val="clear" w:pos="709"/>
+                <w:tab w:val="left" w:pos="0" w:leader="none"/>
+              </w:tabs>
+              <w:bidi w:val="0"/>
+              <w:spacing w:before="0" w:after="0"/>
+              <w:ind w:hanging="0" w:start="0" w:end="0"/>
+              <w:jc w:val="start"/>
+              <w:rPr>
+                <w:rFonts w:ascii="Montserrat;apple-system;BlinkMacSystemFont;Segoe UI;Roboto;Oxygen;Ubuntu;Cantarell;Open Sans;Helvetica Neue;sans-serif" w:hAnsi="Montserrat;apple-system;BlinkMacSystemFont;Segoe UI;Roboto;Oxygen;Ubuntu;Cantarell;Open Sans;Helvetica Neue;sans-serif"/>
+                <w:b w:val="false"/>
+                <w:i w:val="false"/>
+                <w:caps w:val="false"/>
+                <w:smallCaps w:val="false"/>
+                <w:color w:val="2F2F37"/>
+                <w:spacing w:val="0"/>
+                <w:sz w:val="27"/>
+              </w:rPr>
+            </w:pPr>
+            <w:r>
+              <w:rPr>
+                <w:rFonts w:ascii="Montserrat;apple-system;BlinkMacSystemFont;Segoe UI;Roboto;Oxygen;Ubuntu;Cantarell;Open Sans;Helvetica Neue;sans-serif" w:hAnsi="Montserrat;apple-system;BlinkMacSystemFont;Segoe UI;Roboto;Oxygen;Ubuntu;Cantarell;Open Sans;Helvetica Neue;sans-serif"/>
+                <w:b w:val="false"/>
+                <w:i w:val="false"/>
+                <w:caps w:val="false"/>
+                <w:smallCaps w:val="false"/>
+                <w:color w:val="2F2F37"/>
+                <w:spacing w:val="0"/>
+                <w:sz w:val="27"/>
+              </w:rPr>
+              <w:t>Поелементно перебирає оригінальний масив</w:t>
+            </w:r>
+          </w:p>
+          <w:p>
+            <w:pPr>
+              <w:pStyle w:val="BodyText"/>
+              <w:widowControl/>
+              <w:numPr>
+                <w:ilvl w:val="0"/>
+                <w:numId w:val="5"/>
+              </w:numPr>
+              <w:pBdr/>
+              <w:tabs>
+                <w:tab w:val="clear" w:pos="709"/>
+                <w:tab w:val="left" w:pos="0" w:leader="none"/>
+              </w:tabs>
+              <w:bidi w:val="0"/>
+              <w:spacing w:before="0" w:after="0"/>
+              <w:ind w:hanging="0" w:start="0" w:end="0"/>
+              <w:jc w:val="start"/>
+              <w:rPr>
+                <w:rFonts w:ascii="Montserrat;apple-system;BlinkMacSystemFont;Segoe UI;Roboto;Oxygen;Ubuntu;Cantarell;Open Sans;Helvetica Neue;sans-serif" w:hAnsi="Montserrat;apple-system;BlinkMacSystemFont;Segoe UI;Roboto;Oxygen;Ubuntu;Cantarell;Open Sans;Helvetica Neue;sans-serif"/>
+                <w:b w:val="false"/>
+                <w:i w:val="false"/>
+                <w:caps w:val="false"/>
+                <w:smallCaps w:val="false"/>
+                <w:color w:val="2F2F37"/>
+                <w:spacing w:val="0"/>
+                <w:sz w:val="27"/>
+              </w:rPr>
+            </w:pPr>
+            <w:r>
+              <w:rPr>
+                <w:rFonts w:ascii="Montserrat;apple-system;BlinkMacSystemFont;Segoe UI;Roboto;Oxygen;Ubuntu;Cantarell;Open Sans;Helvetica Neue;sans-serif" w:hAnsi="Montserrat;apple-system;BlinkMacSystemFont;Segoe UI;Roboto;Oxygen;Ubuntu;Cantarell;Open Sans;Helvetica Neue;sans-serif"/>
+                <w:b w:val="false"/>
+                <w:i w:val="false"/>
+                <w:caps w:val="false"/>
+                <w:smallCaps w:val="false"/>
+                <w:color w:val="2F2F37"/>
+                <w:spacing w:val="0"/>
+                <w:sz w:val="27"/>
+              </w:rPr>
+              <w:t>Повертає все, що завгодно (об’єкт, масив, рядок, число тощо)</w:t>
+            </w:r>
+          </w:p>
+          <w:p>
+            <w:pPr>
+              <w:pStyle w:val="BodyText"/>
+              <w:widowControl/>
+              <w:numPr>
+                <w:ilvl w:val="0"/>
+                <w:numId w:val="5"/>
+              </w:numPr>
+              <w:pBdr/>
+              <w:tabs>
+                <w:tab w:val="clear" w:pos="709"/>
+                <w:tab w:val="left" w:pos="0" w:leader="none"/>
+              </w:tabs>
+              <w:bidi w:val="0"/>
+              <w:spacing w:before="0" w:after="0"/>
+              <w:ind w:hanging="0" w:start="0" w:end="0"/>
+              <w:jc w:val="start"/>
+              <w:rPr>
+                <w:rFonts w:ascii="Montserrat;apple-system;BlinkMacSystemFont;Segoe UI;Roboto;Oxygen;Ubuntu;Cantarell;Open Sans;Helvetica Neue;sans-serif" w:hAnsi="Montserrat;apple-system;BlinkMacSystemFont;Segoe UI;Roboto;Oxygen;Ubuntu;Cantarell;Open Sans;Helvetica Neue;sans-serif"/>
+                <w:b w:val="false"/>
+                <w:i w:val="false"/>
+                <w:caps w:val="false"/>
+                <w:smallCaps w:val="false"/>
+                <w:color w:val="2F2F37"/>
+                <w:spacing w:val="0"/>
+                <w:sz w:val="27"/>
+              </w:rPr>
+            </w:pPr>
+            <w:r>
+              <w:rPr>
+                <w:rFonts w:ascii="Montserrat;apple-system;BlinkMacSystemFont;Segoe UI;Roboto;Oxygen;Ubuntu;Cantarell;Open Sans;Helvetica Neue;sans-serif" w:hAnsi="Montserrat;apple-system;BlinkMacSystemFont;Segoe UI;Roboto;Oxygen;Ubuntu;Cantarell;Open Sans;Helvetica Neue;sans-serif"/>
+                <w:b w:val="false"/>
+                <w:i w:val="false"/>
+                <w:caps w:val="false"/>
+                <w:smallCaps w:val="false"/>
+                <w:color w:val="2F2F37"/>
+                <w:spacing w:val="0"/>
+                <w:sz w:val="27"/>
+              </w:rPr>
+              <w:t>Може замінити функціонал будь-якого іншого перебираючого методу масиву та навіть їх комбінацію</w:t>
+            </w:r>
+          </w:p>
+          <w:p>
+            <w:pPr>
+              <w:pStyle w:val="BodyText"/>
+              <w:widowControl/>
+              <w:numPr>
+                <w:ilvl w:val="0"/>
+                <w:numId w:val="3"/>
+              </w:numPr>
+              <w:pBdr/>
+              <w:tabs>
+                <w:tab w:val="clear" w:pos="709"/>
+                <w:tab w:val="left" w:pos="0" w:leader="none"/>
+              </w:tabs>
+              <w:bidi w:val="0"/>
+              <w:spacing w:before="0" w:after="0"/>
+              <w:ind w:hanging="0" w:start="0" w:end="0"/>
+              <w:jc w:val="start"/>
+              <w:rPr>
+                <w:rFonts w:ascii="Montserrat;apple-system;BlinkMacSystemFont;Segoe UI;Roboto;Oxygen;Ubuntu;Cantarell;Open Sans;Helvetica Neue;sans-serif" w:hAnsi="Montserrat;apple-system;BlinkMacSystemFont;Segoe UI;Roboto;Oxygen;Ubuntu;Cantarell;Open Sans;Helvetica Neue;sans-serif"/>
+                <w:b w:val="false"/>
+                <w:i w:val="false"/>
+                <w:caps w:val="false"/>
+                <w:smallCaps w:val="false"/>
+                <w:color w:val="2F2F37"/>
+                <w:spacing w:val="0"/>
+                <w:sz w:val="27"/>
+              </w:rPr>
+            </w:pPr>
+            <w:r>
+              <w:rPr>
+                <w:rFonts w:ascii="Montserrat;apple-system;BlinkMacSystemFont;Segoe UI;Roboto;Oxygen;Ubuntu;Cantarell;Open Sans;Helvetica Neue;sans-serif" w:hAnsi="Montserrat;apple-system;BlinkMacSystemFont;Segoe UI;Roboto;Oxygen;Ubuntu;Cantarell;Open Sans;Helvetica Neue;sans-serif"/>
+                <w:b w:val="false"/>
+                <w:i w:val="false"/>
+                <w:caps w:val="false"/>
+                <w:smallCaps w:val="false"/>
+                <w:color w:val="2F2F37"/>
+                <w:spacing w:val="0"/>
+                <w:sz w:val="27"/>
               </w:rPr>
             </w:r>
           </w:p>
@@ -1686,6 +3331,282 @@
       </w:rPr>
     </w:lvl>
   </w:abstractNum>
+  <w:abstractNum w:abstractNumId="4">
+    <w:lvl w:ilvl="0">
+      <w:start w:val="1"/>
+      <w:numFmt w:val="bullet"/>
+      <w:suff w:val="nothing"/>
+      <w:lvlText w:val=""/>
+      <w:lvlJc w:val="start"/>
+      <w:pPr>
+        <w:tabs>
+          <w:tab w:val="num" w:pos="0"/>
+        </w:tabs>
+        <w:ind w:start="0" w:hanging="0"/>
+      </w:pPr>
+      <w:rPr>
+        <w:rFonts w:ascii="Symbol" w:hAnsi="Symbol" w:cs="Symbol" w:hint="default"/>
+      </w:rPr>
+    </w:lvl>
+    <w:lvl w:ilvl="1">
+      <w:start w:val="1"/>
+      <w:numFmt w:val="bullet"/>
+      <w:lvlText w:val=""/>
+      <w:lvlJc w:val="start"/>
+      <w:pPr>
+        <w:tabs>
+          <w:tab w:val="num" w:pos="1418"/>
+        </w:tabs>
+        <w:ind w:start="1418" w:hanging="283"/>
+      </w:pPr>
+      <w:rPr>
+        <w:rFonts w:ascii="Symbol" w:hAnsi="Symbol" w:cs="Symbol" w:hint="default"/>
+      </w:rPr>
+    </w:lvl>
+    <w:lvl w:ilvl="2">
+      <w:start w:val="1"/>
+      <w:numFmt w:val="bullet"/>
+      <w:lvlText w:val=""/>
+      <w:lvlJc w:val="start"/>
+      <w:pPr>
+        <w:tabs>
+          <w:tab w:val="num" w:pos="2127"/>
+        </w:tabs>
+        <w:ind w:start="2127" w:hanging="283"/>
+      </w:pPr>
+      <w:rPr>
+        <w:rFonts w:ascii="Symbol" w:hAnsi="Symbol" w:cs="Symbol" w:hint="default"/>
+      </w:rPr>
+    </w:lvl>
+    <w:lvl w:ilvl="3">
+      <w:start w:val="1"/>
+      <w:numFmt w:val="bullet"/>
+      <w:lvlText w:val=""/>
+      <w:lvlJc w:val="start"/>
+      <w:pPr>
+        <w:tabs>
+          <w:tab w:val="num" w:pos="2836"/>
+        </w:tabs>
+        <w:ind w:start="2836" w:hanging="283"/>
+      </w:pPr>
+      <w:rPr>
+        <w:rFonts w:ascii="Symbol" w:hAnsi="Symbol" w:cs="Symbol" w:hint="default"/>
+      </w:rPr>
+    </w:lvl>
+    <w:lvl w:ilvl="4">
+      <w:start w:val="1"/>
+      <w:numFmt w:val="bullet"/>
+      <w:lvlText w:val=""/>
+      <w:lvlJc w:val="start"/>
+      <w:pPr>
+        <w:tabs>
+          <w:tab w:val="num" w:pos="3545"/>
+        </w:tabs>
+        <w:ind w:start="3545" w:hanging="283"/>
+      </w:pPr>
+      <w:rPr>
+        <w:rFonts w:ascii="Symbol" w:hAnsi="Symbol" w:cs="Symbol" w:hint="default"/>
+      </w:rPr>
+    </w:lvl>
+    <w:lvl w:ilvl="5">
+      <w:start w:val="1"/>
+      <w:numFmt w:val="bullet"/>
+      <w:lvlText w:val=""/>
+      <w:lvlJc w:val="start"/>
+      <w:pPr>
+        <w:tabs>
+          <w:tab w:val="num" w:pos="4254"/>
+        </w:tabs>
+        <w:ind w:start="4254" w:hanging="283"/>
+      </w:pPr>
+      <w:rPr>
+        <w:rFonts w:ascii="Symbol" w:hAnsi="Symbol" w:cs="Symbol" w:hint="default"/>
+      </w:rPr>
+    </w:lvl>
+    <w:lvl w:ilvl="6">
+      <w:start w:val="1"/>
+      <w:numFmt w:val="bullet"/>
+      <w:lvlText w:val=""/>
+      <w:lvlJc w:val="start"/>
+      <w:pPr>
+        <w:tabs>
+          <w:tab w:val="num" w:pos="4963"/>
+        </w:tabs>
+        <w:ind w:start="4963" w:hanging="283"/>
+      </w:pPr>
+      <w:rPr>
+        <w:rFonts w:ascii="Symbol" w:hAnsi="Symbol" w:cs="Symbol" w:hint="default"/>
+      </w:rPr>
+    </w:lvl>
+    <w:lvl w:ilvl="7">
+      <w:start w:val="1"/>
+      <w:numFmt w:val="bullet"/>
+      <w:lvlText w:val=""/>
+      <w:lvlJc w:val="start"/>
+      <w:pPr>
+        <w:tabs>
+          <w:tab w:val="num" w:pos="5672"/>
+        </w:tabs>
+        <w:ind w:start="5672" w:hanging="283"/>
+      </w:pPr>
+      <w:rPr>
+        <w:rFonts w:ascii="Symbol" w:hAnsi="Symbol" w:cs="Symbol" w:hint="default"/>
+      </w:rPr>
+    </w:lvl>
+    <w:lvl w:ilvl="8">
+      <w:start w:val="1"/>
+      <w:numFmt w:val="bullet"/>
+      <w:lvlText w:val=""/>
+      <w:lvlJc w:val="start"/>
+      <w:pPr>
+        <w:tabs>
+          <w:tab w:val="num" w:pos="6381"/>
+        </w:tabs>
+        <w:ind w:start="6381" w:hanging="283"/>
+      </w:pPr>
+      <w:rPr>
+        <w:rFonts w:ascii="Symbol" w:hAnsi="Symbol" w:cs="Symbol" w:hint="default"/>
+      </w:rPr>
+    </w:lvl>
+  </w:abstractNum>
+  <w:abstractNum w:abstractNumId="5">
+    <w:lvl w:ilvl="0">
+      <w:start w:val="1"/>
+      <w:numFmt w:val="bullet"/>
+      <w:suff w:val="nothing"/>
+      <w:lvlText w:val=""/>
+      <w:lvlJc w:val="start"/>
+      <w:pPr>
+        <w:tabs>
+          <w:tab w:val="num" w:pos="0"/>
+        </w:tabs>
+        <w:ind w:start="0" w:hanging="0"/>
+      </w:pPr>
+      <w:rPr>
+        <w:rFonts w:ascii="Symbol" w:hAnsi="Symbol" w:cs="Symbol" w:hint="default"/>
+      </w:rPr>
+    </w:lvl>
+    <w:lvl w:ilvl="1">
+      <w:start w:val="1"/>
+      <w:numFmt w:val="bullet"/>
+      <w:lvlText w:val=""/>
+      <w:lvlJc w:val="start"/>
+      <w:pPr>
+        <w:tabs>
+          <w:tab w:val="num" w:pos="1418"/>
+        </w:tabs>
+        <w:ind w:start="1418" w:hanging="283"/>
+      </w:pPr>
+      <w:rPr>
+        <w:rFonts w:ascii="Symbol" w:hAnsi="Symbol" w:cs="Symbol" w:hint="default"/>
+      </w:rPr>
+    </w:lvl>
+    <w:lvl w:ilvl="2">
+      <w:start w:val="1"/>
+      <w:numFmt w:val="bullet"/>
+      <w:lvlText w:val=""/>
+      <w:lvlJc w:val="start"/>
+      <w:pPr>
+        <w:tabs>
+          <w:tab w:val="num" w:pos="2127"/>
+        </w:tabs>
+        <w:ind w:start="2127" w:hanging="283"/>
+      </w:pPr>
+      <w:rPr>
+        <w:rFonts w:ascii="Symbol" w:hAnsi="Symbol" w:cs="Symbol" w:hint="default"/>
+      </w:rPr>
+    </w:lvl>
+    <w:lvl w:ilvl="3">
+      <w:start w:val="1"/>
+      <w:numFmt w:val="bullet"/>
+      <w:lvlText w:val=""/>
+      <w:lvlJc w:val="start"/>
+      <w:pPr>
+        <w:tabs>
+          <w:tab w:val="num" w:pos="2836"/>
+        </w:tabs>
+        <w:ind w:start="2836" w:hanging="283"/>
+      </w:pPr>
+      <w:rPr>
+        <w:rFonts w:ascii="Symbol" w:hAnsi="Symbol" w:cs="Symbol" w:hint="default"/>
+      </w:rPr>
+    </w:lvl>
+    <w:lvl w:ilvl="4">
+      <w:start w:val="1"/>
+      <w:numFmt w:val="bullet"/>
+      <w:lvlText w:val=""/>
+      <w:lvlJc w:val="start"/>
+      <w:pPr>
+        <w:tabs>
+          <w:tab w:val="num" w:pos="3545"/>
+        </w:tabs>
+        <w:ind w:start="3545" w:hanging="283"/>
+      </w:pPr>
+      <w:rPr>
+        <w:rFonts w:ascii="Symbol" w:hAnsi="Symbol" w:cs="Symbol" w:hint="default"/>
+      </w:rPr>
+    </w:lvl>
+    <w:lvl w:ilvl="5">
+      <w:start w:val="1"/>
+      <w:numFmt w:val="bullet"/>
+      <w:lvlText w:val=""/>
+      <w:lvlJc w:val="start"/>
+      <w:pPr>
+        <w:tabs>
+          <w:tab w:val="num" w:pos="4254"/>
+        </w:tabs>
+        <w:ind w:start="4254" w:hanging="283"/>
+      </w:pPr>
+      <w:rPr>
+        <w:rFonts w:ascii="Symbol" w:hAnsi="Symbol" w:cs="Symbol" w:hint="default"/>
+      </w:rPr>
+    </w:lvl>
+    <w:lvl w:ilvl="6">
+      <w:start w:val="1"/>
+      <w:numFmt w:val="bullet"/>
+      <w:lvlText w:val=""/>
+      <w:lvlJc w:val="start"/>
+      <w:pPr>
+        <w:tabs>
+          <w:tab w:val="num" w:pos="4963"/>
+        </w:tabs>
+        <w:ind w:start="4963" w:hanging="283"/>
+      </w:pPr>
+      <w:rPr>
+        <w:rFonts w:ascii="Symbol" w:hAnsi="Symbol" w:cs="Symbol" w:hint="default"/>
+      </w:rPr>
+    </w:lvl>
+    <w:lvl w:ilvl="7">
+      <w:start w:val="1"/>
+      <w:numFmt w:val="bullet"/>
+      <w:lvlText w:val=""/>
+      <w:lvlJc w:val="start"/>
+      <w:pPr>
+        <w:tabs>
+          <w:tab w:val="num" w:pos="5672"/>
+        </w:tabs>
+        <w:ind w:start="5672" w:hanging="283"/>
+      </w:pPr>
+      <w:rPr>
+        <w:rFonts w:ascii="Symbol" w:hAnsi="Symbol" w:cs="Symbol" w:hint="default"/>
+      </w:rPr>
+    </w:lvl>
+    <w:lvl w:ilvl="8">
+      <w:start w:val="1"/>
+      <w:numFmt w:val="bullet"/>
+      <w:lvlText w:val=""/>
+      <w:lvlJc w:val="start"/>
+      <w:pPr>
+        <w:tabs>
+          <w:tab w:val="num" w:pos="6381"/>
+        </w:tabs>
+        <w:ind w:start="6381" w:hanging="283"/>
+      </w:pPr>
+      <w:rPr>
+        <w:rFonts w:ascii="Symbol" w:hAnsi="Symbol" w:cs="Symbol" w:hint="default"/>
+      </w:rPr>
+    </w:lvl>
+  </w:abstractNum>
   <w:num w:numId="1">
     <w:abstractNumId w:val="1"/>
   </w:num>
@@ -1694,6 +3615,12 @@
   </w:num>
   <w:num w:numId="3">
     <w:abstractNumId w:val="3"/>
+  </w:num>
+  <w:num w:numId="4">
+    <w:abstractNumId w:val="4"/>
+  </w:num>
+  <w:num w:numId="5">
+    <w:abstractNumId w:val="5"/>
   </w:num>
 </w:numbering>
 </file>

</xml_diff>